<commit_message>
Add enabled GitHub Code Quality evidence
</commit_message>
<xml_diff>
--- a/poc-deliverables/FINAL-SonarQube-vs-GitHub-CodeQL-POC-Comparison-Report.docx
+++ b/poc-deliverables/FINAL-SonarQube-vs-GitHub-CodeQL-POC-Comparison-Report.docx
@@ -53,7 +53,7 @@
     <w:p/>
     <w:p>
       <w:r>
-        <w:t>The same POC does not support replacing SonarQube for code quality today. The CodeQL security-and-quality suite detected only one of four designed quality categories, while the separate GitHub Code Quality product is not enabled for this repository. Technical-debt tracking, broad maintainability coverage, coverage/duplication governance, portfolio dashboards, and mature quality gates remain SonarQube strengths.</w:t>
+        <w:t>The POC does not establish that GitHub fully replaces SonarQube for code quality. The CodeQL security-and-quality suite detected one of four designed quality categories, while the newly enabled GitHub Code Quality page reports Excellent maintainability, Excellent reliability, 0 findings, 0 open rules, and 0 AI findings for this repository. Technical-debt tracking, broad maintainability coverage, coverage/duplication governance, portfolio dashboards, and mature quality gates remain SonarQube comparison points that require broader portfolio validation.</w:t>
       </w:r>
     </w:p>
     <w:p/>
@@ -606,7 +606,7 @@
               <w:rPr>
                 <w:sz w:val="18"/>
               </w:rPr>
-              <w:t>Not enabled</w:t>
+              <w:t>Enabled; Excellent maintainability and reliability; 0 findings</w:t>
             </w:r>
           </w:p>
         </w:tc>
@@ -2358,7 +2358,7 @@
     <w:p/>
     <w:p>
       <w:r>
-        <w:t>CodeQL detected one of four designed quality categories (25%). This does not measure the separate GitHub Code Quality product, because that feature is not enabled. The result demonstrates that CodeQL's expanded query suite adds useful quality signals but is not a complete SonarQube quality replacement.</w:t>
+        <w:t>CodeQL detected one of four designed quality categories (25%). Separately, the enabled GitHub Code Quality page reports Excellent maintainability, Excellent reliability, 0 findings, 0 open rules, and 0 AI findings for this repository. This is positive product evidence, but a zero-finding score on a small synthetic POC is not equivalent to proving SonarQube feature parity; the same benchmark should be repeated on representative production repositories.</w:t>
       </w:r>
     </w:p>
     <w:p/>
@@ -2403,13 +2403,9 @@
         <w:gridCol w:w="2424"/>
       </w:tblGrid>
       <w:tr>
-        <w:trPr>
-          <w:tblHeader/>
-        </w:trPr>
-        <w:tc>
-          <w:tcPr>
-            <w:tcW w:w="1250" w:type="pct"/>
-            <w:shd w:val="clear" w:color="auto" w:fill="D9D9D9"/>
+        <w:tc>
+          <w:tcPr>
+            <w:tcW w:w="1250" w:type="pct"/>
           </w:tcPr>
           <w:p>
             <w:pPr>
@@ -2431,7 +2427,6 @@
         <w:tc>
           <w:tcPr>
             <w:tcW w:w="1250" w:type="pct"/>
-            <w:shd w:val="clear" w:color="auto" w:fill="D9D9D9"/>
           </w:tcPr>
           <w:p>
             <w:pPr>
@@ -2453,7 +2448,6 @@
         <w:tc>
           <w:tcPr>
             <w:tcW w:w="1250" w:type="pct"/>
-            <w:shd w:val="clear" w:color="auto" w:fill="D9D9D9"/>
           </w:tcPr>
           <w:p>
             <w:pPr>
@@ -2475,7 +2469,6 @@
         <w:tc>
           <w:tcPr>
             <w:tcW w:w="1250" w:type="pct"/>
-            <w:shd w:val="clear" w:color="auto" w:fill="D9D9D9"/>
           </w:tcPr>
           <w:p>
             <w:pPr>
@@ -2705,7 +2698,7 @@
               <w:rPr>
                 <w:sz w:val="18"/>
               </w:rPr>
-              <w:t>Limited in CodeQL suite; Code Quality not enabled</w:t>
+              <w:t>Code Quality enabled; no open findings in this POC</w:t>
             </w:r>
           </w:p>
         </w:tc>
@@ -3369,7 +3362,6 @@
               <w:rPr>
                 <w:sz w:val="18"/>
               </w:rPr>
-              <w:lastRenderedPageBreak/>
               <w:t>Audit evidence</w:t>
             </w:r>
           </w:p>
@@ -4188,7 +4180,6 @@
       </w:pPr>
       <w:bookmarkStart w:id="8" w:name="_Toc236746319"/>
       <w:r>
-        <w:lastRenderedPageBreak/>
         <w:t>SonarQube</w:t>
       </w:r>
       <w:bookmarkEnd w:id="8"/>
@@ -4385,7 +4376,7 @@
         <w:pStyle w:val="ListBullet"/>
       </w:pPr>
       <w:r>
-        <w:t>GitHub Code Quality is entitlement-dependent and not enabled in this repository.</w:t>
+        <w:t>GitHub Code Quality is now enabled and reports Excellent maintainability and reliability with 0 findings in this small POC.</w:t>
       </w:r>
     </w:p>
     <w:p>
@@ -4433,7 +4424,6 @@
         <w:pStyle w:val="Heading1"/>
       </w:pPr>
       <w:r>
-        <w:lastRenderedPageBreak/>
         <w:t>11. Alternatives and implementation considerations</w:t>
       </w:r>
     </w:p>
@@ -4510,7 +4500,7 @@
         <w:pStyle w:val="ListBullet"/>
       </w:pPr>
       <w:r>
-        <w:t>Enable GitHub Code Quality and benchmark its rule coverage before production rollout.</w:t>
+        <w:t>GitHub Code Quality is enabled for this repository; validate its ratings and rule coverage on representative production repositories before rollout.</w:t>
       </w:r>
     </w:p>
     <w:p>
@@ -4559,7 +4549,6 @@
         <w:pStyle w:val="Heading1"/>
       </w:pPr>
       <w:r>
-        <w:lastRenderedPageBreak/>
         <w:t>12. Evidence gallery</w:t>
       </w:r>
     </w:p>
@@ -4633,7 +4622,6 @@
         <w:rPr>
           <w:noProof/>
         </w:rPr>
-        <w:lastRenderedPageBreak/>
         <w:drawing>
           <wp:inline distT="0" distB="0" distL="0" distR="0" wp14:anchorId="20F31F8D" wp14:editId="2CFBBCFC">
             <wp:extent cx="5943600" cy="5457996"/>
@@ -4695,9 +4683,8 @@
         <w:rPr>
           <w:noProof/>
         </w:rPr>
-        <w:lastRenderedPageBreak/>
         <w:drawing>
-          <wp:inline distT="0" distB="0" distL="0" distR="0" wp14:anchorId="55251B47" wp14:editId="2587C202">
+          <wp:inline distT="0" distB="0" distL="0" distR="0" wp14:anchorId="55251B47" wp14:editId="0F6B3736">
             <wp:extent cx="4371178" cy="7429500"/>
             <wp:effectExtent l="0" t="0" r="0" b="0"/>
             <wp:docPr id="1143781297" name="Picture 3"/>
@@ -4757,7 +4744,6 @@
         <w:rPr>
           <w:noProof/>
         </w:rPr>
-        <w:lastRenderedPageBreak/>
         <w:drawing>
           <wp:inline distT="0" distB="0" distL="0" distR="0" wp14:anchorId="61A1B7CF" wp14:editId="145D1F23">
             <wp:extent cx="5943600" cy="5069145"/>
@@ -4819,7 +4805,6 @@
         <w:rPr>
           <w:noProof/>
         </w:rPr>
-        <w:lastRenderedPageBreak/>
         <w:drawing>
           <wp:inline distT="0" distB="0" distL="0" distR="0" wp14:anchorId="5B0BA3AD" wp14:editId="24D0FBD7">
             <wp:extent cx="5943600" cy="6439614"/>
@@ -4881,12 +4866,11 @@
         <w:rPr>
           <w:noProof/>
         </w:rPr>
-        <w:lastRenderedPageBreak/>
         <w:drawing>
-          <wp:inline distT="0" distB="0" distL="0" distR="0" wp14:anchorId="71FEB979" wp14:editId="421BFC09">
-            <wp:extent cx="5943600" cy="4601299"/>
-            <wp:effectExtent l="0" t="0" r="0" b="8890"/>
-            <wp:docPr id="1392014784" name="Picture 6"/>
+          <wp:inline distT="0" distB="0" distL="0" distR="0" wp14:anchorId="4133A075" wp14:editId="50B1E483">
+            <wp:extent cx="5943600" cy="4968105"/>
+            <wp:effectExtent l="0" t="0" r="0" b="4445"/>
+            <wp:docPr id="1194160425" name="Picture 1"/>
             <wp:cNvGraphicFramePr>
               <a:graphicFrameLocks xmlns:a="http://schemas.openxmlformats.org/drawingml/2006/main" noChangeAspect="1"/>
             </wp:cNvGraphicFramePr>
@@ -4894,11 +4878,11 @@
               <a:graphicData uri="http://schemas.openxmlformats.org/drawingml/2006/picture">
                 <pic:pic xmlns:pic="http://schemas.openxmlformats.org/drawingml/2006/picture">
                   <pic:nvPicPr>
-                    <pic:cNvPr id="1392014784" name=""/>
+                    <pic:cNvPr id="1194160425" name=""/>
                     <pic:cNvPicPr/>
                   </pic:nvPicPr>
                   <pic:blipFill>
-                    <a:blip r:embed="rId12">
+                    <a:blip r:embed="rId12" cstate="print">
                       <a:extLst>
                         <a:ext uri="{28A0092B-C50C-407E-A947-70E740481C1C}">
                           <a14:useLocalDpi xmlns:a14="http://schemas.microsoft.com/office/drawing/2010/main" val="0"/>
@@ -4912,7 +4896,7 @@
                   <pic:spPr>
                     <a:xfrm>
                       <a:off x="0" y="0"/>
-                      <a:ext cx="5943600" cy="4601299"/>
+                      <a:ext cx="5943600" cy="4968105"/>
                     </a:xfrm>
                     <a:prstGeom prst="rect">
                       <a:avLst/>
@@ -4927,16 +4911,106 @@
     </w:p>
     <w:p>
       <w:pPr>
+        <w:rPr>
+          <w:i/>
+          <w:iCs/>
+          <w:color w:val="0E2841" w:themeColor="text2"/>
+          <w:sz w:val="18"/>
+          <w:szCs w:val="18"/>
+        </w:rPr>
+      </w:pPr>
+      <w:r>
+        <w:rPr>
+          <w:i/>
+          <w:iCs/>
+          <w:color w:val="0E2841" w:themeColor="text2"/>
+          <w:sz w:val="18"/>
+          <w:szCs w:val="18"/>
+        </w:rPr>
+        <w:t>Figure 6 — GitHub Code Quality is enabled: Excellent maintainability, Excellent reliability, and 0 open findings.</w:t>
+      </w:r>
+    </w:p>
+    <w:p>
+      <w:pPr>
         <w:pStyle w:val="Caption"/>
-        <w:jc w:val="center"/>
-      </w:pPr>
-      <w:r>
-        <w:t>Figure 6 — GitHub Code Quality is not enabled for this repository.</w:t>
+      </w:pPr>
+    </w:p>
+    <w:p>
+      <w:pPr>
+        <w:spacing w:after="160"/>
+      </w:pPr>
+      <w:r>
+        <w:br w:type="page"/>
+      </w:r>
+    </w:p>
+    <w:p>
+      <w:pPr>
+        <w:pStyle w:val="Heading1"/>
+      </w:pPr>
+      <w:r>
+        <w:t>13. Evidence links</w:t>
       </w:r>
     </w:p>
     <w:p/>
     <w:p>
       <w:pPr>
+        <w:pStyle w:val="ListBullet"/>
+      </w:pPr>
+      <w:r>
+        <w:t>Pull request: https://github.com/ms-pwc/github-codeql-poc/pull/1</w:t>
+      </w:r>
+    </w:p>
+    <w:p>
+      <w:pPr>
+        <w:pStyle w:val="ListBullet"/>
+      </w:pPr>
+      <w:r>
+        <w:t>Final workflow: https://github.com/ms-pwc/github-codeql-poc/actions/runs/30892230825</w:t>
+      </w:r>
+    </w:p>
+    <w:p>
+      <w:pPr>
+        <w:pStyle w:val="ListBullet"/>
+      </w:pPr>
+      <w:r>
+        <w:t>CodeQL check: https://github.com/ms-pwc/github-codeql-poc/runs/91936994594</w:t>
+      </w:r>
+    </w:p>
+    <w:p>
+      <w:pPr>
+        <w:pStyle w:val="ListBullet"/>
+      </w:pPr>
+      <w:r>
+        <w:t>Branch alerts: https://github.com/ms-pwc/github-codeql-poc/security/code-scanning?query=pr%3A1+tool%3ACodeQL+is%3Aopen</w:t>
+      </w:r>
+    </w:p>
+    <w:p>
+      <w:pPr>
+        <w:pStyle w:val="ListBullet"/>
+      </w:pPr>
+      <w:r>
+        <w:t>Benchmark matrix: docs/extended-benchmark-matrix.md</w:t>
+      </w:r>
+    </w:p>
+    <w:p>
+      <w:pPr>
+        <w:pStyle w:val="ListBullet"/>
+      </w:pPr>
+      <w:r>
+        <w:t>Benchmark source: src/main/java/com/example/ExtendedSecurityBenchmarkServlet.java</w:t>
+      </w:r>
+    </w:p>
+    <w:p>
+      <w:pPr>
+        <w:pStyle w:val="ListBullet"/>
+      </w:pPr>
+      <w:r>
+        <w:t>Secure controls: src/main/java/com/example/SecureNegativeControls.java</w:t>
+      </w:r>
+    </w:p>
+    <w:p/>
+    <w:p>
+      <w:pPr>
         <w:spacing w:after="160"/>
       </w:pPr>
       <w:r>
@@ -4948,8 +5022,7 @@
         <w:pStyle w:val="Heading1"/>
       </w:pPr>
       <w:r>
-        <w:lastRenderedPageBreak/>
-        <w:t>13. Evidence links</w:t>
+        <w:t>14. Product references</w:t>
       </w:r>
     </w:p>
     <w:p/>
@@ -4958,7 +5031,7 @@
         <w:pStyle w:val="ListBullet"/>
       </w:pPr>
       <w:r>
-        <w:t>Pull request: https://github.com/ms-pwc/github-codeql-poc/pull/1</w:t>
+        <w:t>GitHub CodeQL code scanning: https://docs.github.com/en/code-security/code-scanning/introduction-to-code-scanning/about-code-scanning-with-codeql</w:t>
       </w:r>
     </w:p>
     <w:p>
@@ -4966,7 +5039,7 @@
         <w:pStyle w:val="ListBullet"/>
       </w:pPr>
       <w:r>
-        <w:t>Final workflow: https://github.com/ms-pwc/github-codeql-poc/actions/runs/30892230825</w:t>
+        <w:t>GitHub Secret Scanning: https://docs.github.com/en/code-security/secret-scanning/introduction/about-secret-scanning</w:t>
       </w:r>
     </w:p>
     <w:p>
@@ -4974,7 +5047,7 @@
         <w:pStyle w:val="ListBullet"/>
       </w:pPr>
       <w:r>
-        <w:t>CodeQL check: https://github.com/ms-pwc/github-codeql-poc/runs/91936994594</w:t>
+        <w:t>GitHub Code Quality: https://docs.github.com/code-security/code-quality/concepts/about-code-quality</w:t>
       </w:r>
     </w:p>
     <w:p>
@@ -4982,7 +5055,7 @@
         <w:pStyle w:val="ListBullet"/>
       </w:pPr>
       <w:r>
-        <w:t>Branch alerts: https://github.com/ms-pwc/github-codeql-poc/security/code-scanning?query=pr%3A1+tool%3ACodeQL+is%3Aopen</w:t>
+        <w:t>SonarQube documentation: https://docs.sonarsource.com/sonarqube-server/latest/</w:t>
       </w:r>
     </w:p>
     <w:p>
@@ -4990,23 +5063,7 @@
         <w:pStyle w:val="ListBullet"/>
       </w:pPr>
       <w:r>
-        <w:t>Benchmark matrix: docs/extended-benchmark-matrix.md</w:t>
-      </w:r>
-    </w:p>
-    <w:p>
-      <w:pPr>
-        <w:pStyle w:val="ListBullet"/>
-      </w:pPr>
-      <w:r>
-        <w:t>Benchmark source: src/main/java/com/example/ExtendedSecurityBenchmarkServlet.java</w:t>
-      </w:r>
-    </w:p>
-    <w:p>
-      <w:pPr>
-        <w:pStyle w:val="ListBullet"/>
-      </w:pPr>
-      <w:r>
-        <w:t>Secure controls: src/main/java/com/example/SecureNegativeControls.java</w:t>
+        <w:t>SonarQube plans and pricing: https://www.sonarsource.com/plans-and-pricing/</w:t>
       </w:r>
     </w:p>
     <w:p/>
@@ -5023,72 +5080,12 @@
         <w:pStyle w:val="Heading1"/>
       </w:pPr>
       <w:r>
-        <w:lastRenderedPageBreak/>
-        <w:t>14. Product references</w:t>
+        <w:t>15. Limitations</w:t>
       </w:r>
     </w:p>
     <w:p/>
     <w:p>
       <w:pPr>
-        <w:pStyle w:val="ListBullet"/>
-      </w:pPr>
-      <w:r>
-        <w:t>GitHub CodeQL code scanning: https://docs.github.com/en/code-security/code-scanning/introduction-to-code-scanning/about-code-scanning-with-codeql</w:t>
-      </w:r>
-    </w:p>
-    <w:p>
-      <w:pPr>
-        <w:pStyle w:val="ListBullet"/>
-      </w:pPr>
-      <w:r>
-        <w:t>GitHub Secret Scanning: https://docs.github.com/en/code-security/secret-scanning/introduction/about-secret-scanning</w:t>
-      </w:r>
-    </w:p>
-    <w:p>
-      <w:pPr>
-        <w:pStyle w:val="ListBullet"/>
-      </w:pPr>
-      <w:r>
-        <w:t>GitHub Code Quality: https://docs.github.com/code-security/code-quality/concepts/about-code-quality</w:t>
-      </w:r>
-    </w:p>
-    <w:p>
-      <w:pPr>
-        <w:pStyle w:val="ListBullet"/>
-      </w:pPr>
-      <w:r>
-        <w:t>SonarQube documentation: https://docs.sonarsource.com/sonarqube-server/latest/</w:t>
-      </w:r>
-    </w:p>
-    <w:p>
-      <w:pPr>
-        <w:pStyle w:val="ListBullet"/>
-      </w:pPr>
-      <w:r>
-        <w:t>SonarQube plans and pricing: https://www.sonarsource.com/plans-and-pricing/</w:t>
-      </w:r>
-    </w:p>
-    <w:p/>
-    <w:p>
-      <w:pPr>
-        <w:spacing w:after="160"/>
-      </w:pPr>
-      <w:r>
-        <w:br w:type="page"/>
-      </w:r>
-    </w:p>
-    <w:p>
-      <w:pPr>
-        <w:pStyle w:val="Heading1"/>
-      </w:pPr>
-      <w:r>
-        <w:lastRenderedPageBreak/>
-        <w:t>15. Limitations</w:t>
-      </w:r>
-    </w:p>
-    <w:p/>
-    <w:p>
-      <w:pPr>
         <w:pStyle w:val="ListNumber"/>
       </w:pPr>
       <w:r>
@@ -5133,12 +5130,8 @@
       </w:pPr>
     </w:p>
     <w:sectPr>
-      <w:headerReference w:type="even" r:id="rId13"/>
-      <w:headerReference w:type="default" r:id="rId14"/>
-      <w:footerReference w:type="even" r:id="rId15"/>
-      <w:footerReference w:type="default" r:id="rId16"/>
-      <w:headerReference w:type="first" r:id="rId17"/>
-      <w:footerReference w:type="first" r:id="rId18"/>
+      <w:headerReference w:type="default" r:id="rId13"/>
+      <w:footerReference w:type="default" r:id="rId14"/>
       <w:pgSz w:w="11906" w:h="16838"/>
       <w:pgMar w:top="1000" w:right="1100" w:bottom="1000" w:left="1100" w:header="708" w:footer="708" w:gutter="0"/>
       <w:cols w:space="708"/>
@@ -5174,16 +5167,6 @@
 </file>
 
 <file path=word/footer1.xml><?xml version="1.0" encoding="utf-8"?>
-<w:ftr xmlns:wpc="http://schemas.microsoft.com/office/word/2010/wordprocessingCanvas" xmlns:cx="http://schemas.microsoft.com/office/drawing/2014/chartex" xmlns:cx1="http://schemas.microsoft.com/office/drawing/2015/9/8/chartex" xmlns:cx2="http://schemas.microsoft.com/office/drawing/2015/10/21/chartex" xmlns:cx3="http://schemas.microsoft.com/office/drawing/2016/5/9/chartex" xmlns:cx4="http://schemas.microsoft.com/office/drawing/2016/5/10/chartex" xmlns:cx5="http://schemas.microsoft.com/office/drawing/2016/5/11/chartex" xmlns:cx6="http://schemas.microsoft.com/office/drawing/2016/5/12/chartex" xmlns:cx7="http://schemas.microsoft.com/office/drawing/2016/5/13/chartex" xmlns:cx8="http://schemas.microsoft.com/office/drawing/2016/5/14/chartex" xmlns:mc="http://schemas.openxmlformats.org/markup-compatibility/2006" xmlns:aink="http://schemas.microsoft.com/office/drawing/2016/ink" xmlns:am3d="http://schemas.microsoft.com/office/drawing/2017/model3d" xmlns:o="urn:schemas-microsoft-com:office:office" xmlns:oel="http://schemas.microsoft.com/office/2019/extlst" xmlns:r="http://schemas.openxmlformats.org/officeDocument/2006/relationships" xmlns:m="http://schemas.openxmlformats.org/officeDocument/2006/math" xmlns:v="urn:schemas-microsoft-com:vml" xmlns:wp14="http://schemas.microsoft.com/office/word/2010/wordprocessingDrawing" xmlns:wp="http://schemas.openxmlformats.org/drawingml/2006/wordprocessingDrawing" xmlns:w10="urn:schemas-microsoft-com:office:word" xmlns:w="http://schemas.openxmlformats.org/wordprocessingml/2006/main" xmlns:w14="http://schemas.microsoft.com/office/word/2010/wordml" xmlns:w15="http://schemas.microsoft.com/office/word/2012/wordml" xmlns:w16cei="http://schemas.microsoft.com/office/word/2026/wordml/cei" xmlns:w16cex="http://schemas.microsoft.com/office/word/2018/wordml/cex" xmlns:w16cid="http://schemas.microsoft.com/office/word/2016/wordml/cid" xmlns:w16="http://schemas.microsoft.com/office/word/2018/wordml" xmlns:w16du="http://schemas.microsoft.com/office/word/2023/wordml/word16du" xmlns:w16sdtdh="http://schemas.microsoft.com/office/word/2020/wordml/sdtdatahash" xmlns:w16sdtfl="http://schemas.microsoft.com/office/word/2024/wordml/sdtformatlock" xmlns:w16se="http://schemas.microsoft.com/office/word/2015/wordml/symex" xmlns:wpg="http://schemas.microsoft.com/office/word/2010/wordprocessingGroup" xmlns:wpi="http://schemas.microsoft.com/office/word/2010/wordprocessingInk" xmlns:wne="http://schemas.microsoft.com/office/word/2006/wordml" xmlns:wps="http://schemas.microsoft.com/office/word/2010/wordprocessingShape" mc:Ignorable="w14 w15 w16se w16cid w16 w16cex w16sdtdh w16sdtfl w16du wp14">
-  <w:p>
-    <w:pPr>
-      <w:pStyle w:val="Footer"/>
-    </w:pPr>
-  </w:p>
-</w:ftr>
-</file>
-
-<file path=word/footer2.xml><?xml version="1.0" encoding="utf-8"?>
 <w:ftr xmlns:wpc="http://schemas.microsoft.com/office/word/2010/wordprocessingCanvas" xmlns:cx="http://schemas.microsoft.com/office/drawing/2014/chartex" xmlns:cx1="http://schemas.microsoft.com/office/drawing/2015/9/8/chartex" xmlns:cx2="http://schemas.microsoft.com/office/drawing/2015/10/21/chartex" xmlns:cx3="http://schemas.microsoft.com/office/drawing/2016/5/9/chartex" xmlns:cx4="http://schemas.microsoft.com/office/drawing/2016/5/10/chartex" xmlns:cx5="http://schemas.microsoft.com/office/drawing/2016/5/11/chartex" xmlns:cx6="http://schemas.microsoft.com/office/drawing/2016/5/12/chartex" xmlns:cx7="http://schemas.microsoft.com/office/drawing/2016/5/13/chartex" xmlns:cx8="http://schemas.microsoft.com/office/drawing/2016/5/14/chartex" xmlns:mc="http://schemas.openxmlformats.org/markup-compatibility/2006" xmlns:aink="http://schemas.microsoft.com/office/drawing/2016/ink" xmlns:am3d="http://schemas.microsoft.com/office/drawing/2017/model3d" xmlns:o="urn:schemas-microsoft-com:office:office" xmlns:oel="http://schemas.microsoft.com/office/2019/extlst" xmlns:r="http://schemas.openxmlformats.org/officeDocument/2006/relationships" xmlns:m="http://schemas.openxmlformats.org/officeDocument/2006/math" xmlns:v="urn:schemas-microsoft-com:vml" xmlns:wp14="http://schemas.microsoft.com/office/word/2010/wordprocessingDrawing" xmlns:wp="http://schemas.openxmlformats.org/drawingml/2006/wordprocessingDrawing" xmlns:w10="urn:schemas-microsoft-com:office:word" xmlns:w="http://schemas.openxmlformats.org/wordprocessingml/2006/main" xmlns:w14="http://schemas.microsoft.com/office/word/2010/wordml" xmlns:w15="http://schemas.microsoft.com/office/word/2012/wordml" xmlns:w16cei="http://schemas.microsoft.com/office/word/2026/wordml/cei" xmlns:w16cex="http://schemas.microsoft.com/office/word/2018/wordml/cex" xmlns:w16cid="http://schemas.microsoft.com/office/word/2016/wordml/cid" xmlns:w16="http://schemas.microsoft.com/office/word/2018/wordml" xmlns:w16du="http://schemas.microsoft.com/office/word/2023/wordml/word16du" xmlns:w16sdtdh="http://schemas.microsoft.com/office/word/2020/wordml/sdtdatahash" xmlns:w16sdtfl="http://schemas.microsoft.com/office/word/2024/wordml/sdtformatlock" xmlns:w16se="http://schemas.microsoft.com/office/word/2015/wordml/symex" xmlns:wpg="http://schemas.microsoft.com/office/word/2010/wordprocessingGroup" xmlns:wpi="http://schemas.microsoft.com/office/word/2010/wordprocessingInk" xmlns:wne="http://schemas.microsoft.com/office/word/2006/wordml" xmlns:wps="http://schemas.microsoft.com/office/word/2010/wordprocessingShape" mc:Ignorable="w14 w15 w16se w16cid w16 w16cex w16sdtdh w16sdtfl w16du wp14">
   <w:p>
     <w:pPr>
@@ -5218,16 +5201,6 @@
 </w:ftr>
 </file>
 
-<file path=word/footer3.xml><?xml version="1.0" encoding="utf-8"?>
-<w:ftr xmlns:wpc="http://schemas.microsoft.com/office/word/2010/wordprocessingCanvas" xmlns:cx="http://schemas.microsoft.com/office/drawing/2014/chartex" xmlns:cx1="http://schemas.microsoft.com/office/drawing/2015/9/8/chartex" xmlns:cx2="http://schemas.microsoft.com/office/drawing/2015/10/21/chartex" xmlns:cx3="http://schemas.microsoft.com/office/drawing/2016/5/9/chartex" xmlns:cx4="http://schemas.microsoft.com/office/drawing/2016/5/10/chartex" xmlns:cx5="http://schemas.microsoft.com/office/drawing/2016/5/11/chartex" xmlns:cx6="http://schemas.microsoft.com/office/drawing/2016/5/12/chartex" xmlns:cx7="http://schemas.microsoft.com/office/drawing/2016/5/13/chartex" xmlns:cx8="http://schemas.microsoft.com/office/drawing/2016/5/14/chartex" xmlns:mc="http://schemas.openxmlformats.org/markup-compatibility/2006" xmlns:aink="http://schemas.microsoft.com/office/drawing/2016/ink" xmlns:am3d="http://schemas.microsoft.com/office/drawing/2017/model3d" xmlns:o="urn:schemas-microsoft-com:office:office" xmlns:oel="http://schemas.microsoft.com/office/2019/extlst" xmlns:r="http://schemas.openxmlformats.org/officeDocument/2006/relationships" xmlns:m="http://schemas.openxmlformats.org/officeDocument/2006/math" xmlns:v="urn:schemas-microsoft-com:vml" xmlns:wp14="http://schemas.microsoft.com/office/word/2010/wordprocessingDrawing" xmlns:wp="http://schemas.openxmlformats.org/drawingml/2006/wordprocessingDrawing" xmlns:w10="urn:schemas-microsoft-com:office:word" xmlns:w="http://schemas.openxmlformats.org/wordprocessingml/2006/main" xmlns:w14="http://schemas.microsoft.com/office/word/2010/wordml" xmlns:w15="http://schemas.microsoft.com/office/word/2012/wordml" xmlns:w16cei="http://schemas.microsoft.com/office/word/2026/wordml/cei" xmlns:w16cex="http://schemas.microsoft.com/office/word/2018/wordml/cex" xmlns:w16cid="http://schemas.microsoft.com/office/word/2016/wordml/cid" xmlns:w16="http://schemas.microsoft.com/office/word/2018/wordml" xmlns:w16du="http://schemas.microsoft.com/office/word/2023/wordml/word16du" xmlns:w16sdtdh="http://schemas.microsoft.com/office/word/2020/wordml/sdtdatahash" xmlns:w16sdtfl="http://schemas.microsoft.com/office/word/2024/wordml/sdtformatlock" xmlns:w16se="http://schemas.microsoft.com/office/word/2015/wordml/symex" xmlns:wpg="http://schemas.microsoft.com/office/word/2010/wordprocessingGroup" xmlns:wpi="http://schemas.microsoft.com/office/word/2010/wordprocessingInk" xmlns:wne="http://schemas.microsoft.com/office/word/2006/wordml" xmlns:wps="http://schemas.microsoft.com/office/word/2010/wordprocessingShape" mc:Ignorable="w14 w15 w16se w16cid w16 w16cex w16sdtdh w16sdtfl w16du wp14">
-  <w:p>
-    <w:pPr>
-      <w:pStyle w:val="Footer"/>
-    </w:pPr>
-  </w:p>
-</w:ftr>
-</file>
-
 <file path=word/footnotes.xml><?xml version="1.0" encoding="utf-8"?>
 <w:footnotes xmlns:wpc="http://schemas.microsoft.com/office/word/2010/wordprocessingCanvas" xmlns:cx="http://schemas.microsoft.com/office/drawing/2014/chartex" xmlns:cx1="http://schemas.microsoft.com/office/drawing/2015/9/8/chartex" xmlns:cx2="http://schemas.microsoft.com/office/drawing/2015/10/21/chartex" xmlns:cx3="http://schemas.microsoft.com/office/drawing/2016/5/9/chartex" xmlns:cx4="http://schemas.microsoft.com/office/drawing/2016/5/10/chartex" xmlns:cx5="http://schemas.microsoft.com/office/drawing/2016/5/11/chartex" xmlns:cx6="http://schemas.microsoft.com/office/drawing/2016/5/12/chartex" xmlns:cx7="http://schemas.microsoft.com/office/drawing/2016/5/13/chartex" xmlns:cx8="http://schemas.microsoft.com/office/drawing/2016/5/14/chartex" xmlns:mc="http://schemas.openxmlformats.org/markup-compatibility/2006" xmlns:aink="http://schemas.microsoft.com/office/drawing/2016/ink" xmlns:am3d="http://schemas.microsoft.com/office/drawing/2017/model3d" xmlns:o="urn:schemas-microsoft-com:office:office" xmlns:oel="http://schemas.microsoft.com/office/2019/extlst" xmlns:r="http://schemas.openxmlformats.org/officeDocument/2006/relationships" xmlns:m="http://schemas.openxmlformats.org/officeDocument/2006/math" xmlns:v="urn:schemas-microsoft-com:vml" xmlns:wp14="http://schemas.microsoft.com/office/word/2010/wordprocessingDrawing" xmlns:wp="http://schemas.openxmlformats.org/drawingml/2006/wordprocessingDrawing" xmlns:w10="urn:schemas-microsoft-com:office:word" xmlns:w="http://schemas.openxmlformats.org/wordprocessingml/2006/main" xmlns:w14="http://schemas.microsoft.com/office/word/2010/wordml" xmlns:w15="http://schemas.microsoft.com/office/word/2012/wordml" xmlns:w16cei="http://schemas.microsoft.com/office/word/2026/wordml/cei" xmlns:w16cex="http://schemas.microsoft.com/office/word/2018/wordml/cex" xmlns:w16cid="http://schemas.microsoft.com/office/word/2016/wordml/cid" xmlns:w16="http://schemas.microsoft.com/office/word/2018/wordml" xmlns:w16du="http://schemas.microsoft.com/office/word/2023/wordml/word16du" xmlns:w16sdtdh="http://schemas.microsoft.com/office/word/2020/wordml/sdtdatahash" xmlns:w16sdtfl="http://schemas.microsoft.com/office/word/2024/wordml/sdtformatlock" xmlns:w16se="http://schemas.microsoft.com/office/word/2015/wordml/symex" xmlns:wpg="http://schemas.microsoft.com/office/word/2010/wordprocessingGroup" xmlns:wpi="http://schemas.microsoft.com/office/word/2010/wordprocessingInk" xmlns:wne="http://schemas.microsoft.com/office/word/2006/wordml" xmlns:wps="http://schemas.microsoft.com/office/word/2010/wordprocessingShape" mc:Ignorable="w14 w15 w16se w16cid w16 w16cex w16sdtdh w16sdtfl w16du wp14">
   <w:footnote w:type="separator" w:id="-1">
@@ -5254,16 +5227,6 @@
 </file>
 
 <file path=word/header1.xml><?xml version="1.0" encoding="utf-8"?>
-<w:hdr xmlns:wpc="http://schemas.microsoft.com/office/word/2010/wordprocessingCanvas" xmlns:cx="http://schemas.microsoft.com/office/drawing/2014/chartex" xmlns:cx1="http://schemas.microsoft.com/office/drawing/2015/9/8/chartex" xmlns:cx2="http://schemas.microsoft.com/office/drawing/2015/10/21/chartex" xmlns:cx3="http://schemas.microsoft.com/office/drawing/2016/5/9/chartex" xmlns:cx4="http://schemas.microsoft.com/office/drawing/2016/5/10/chartex" xmlns:cx5="http://schemas.microsoft.com/office/drawing/2016/5/11/chartex" xmlns:cx6="http://schemas.microsoft.com/office/drawing/2016/5/12/chartex" xmlns:cx7="http://schemas.microsoft.com/office/drawing/2016/5/13/chartex" xmlns:cx8="http://schemas.microsoft.com/office/drawing/2016/5/14/chartex" xmlns:mc="http://schemas.openxmlformats.org/markup-compatibility/2006" xmlns:aink="http://schemas.microsoft.com/office/drawing/2016/ink" xmlns:am3d="http://schemas.microsoft.com/office/drawing/2017/model3d" xmlns:o="urn:schemas-microsoft-com:office:office" xmlns:oel="http://schemas.microsoft.com/office/2019/extlst" xmlns:r="http://schemas.openxmlformats.org/officeDocument/2006/relationships" xmlns:m="http://schemas.openxmlformats.org/officeDocument/2006/math" xmlns:v="urn:schemas-microsoft-com:vml" xmlns:wp14="http://schemas.microsoft.com/office/word/2010/wordprocessingDrawing" xmlns:wp="http://schemas.openxmlformats.org/drawingml/2006/wordprocessingDrawing" xmlns:w10="urn:schemas-microsoft-com:office:word" xmlns:w="http://schemas.openxmlformats.org/wordprocessingml/2006/main" xmlns:w14="http://schemas.microsoft.com/office/word/2010/wordml" xmlns:w15="http://schemas.microsoft.com/office/word/2012/wordml" xmlns:w16cei="http://schemas.microsoft.com/office/word/2026/wordml/cei" xmlns:w16cex="http://schemas.microsoft.com/office/word/2018/wordml/cex" xmlns:w16cid="http://schemas.microsoft.com/office/word/2016/wordml/cid" xmlns:w16="http://schemas.microsoft.com/office/word/2018/wordml" xmlns:w16du="http://schemas.microsoft.com/office/word/2023/wordml/word16du" xmlns:w16sdtdh="http://schemas.microsoft.com/office/word/2020/wordml/sdtdatahash" xmlns:w16sdtfl="http://schemas.microsoft.com/office/word/2024/wordml/sdtformatlock" xmlns:w16se="http://schemas.microsoft.com/office/word/2015/wordml/symex" xmlns:wpg="http://schemas.microsoft.com/office/word/2010/wordprocessingGroup" xmlns:wpi="http://schemas.microsoft.com/office/word/2010/wordprocessingInk" xmlns:wne="http://schemas.microsoft.com/office/word/2006/wordml" xmlns:wps="http://schemas.microsoft.com/office/word/2010/wordprocessingShape" mc:Ignorable="w14 w15 w16se w16cid w16 w16cex w16sdtdh w16sdtfl w16du wp14">
-  <w:p>
-    <w:pPr>
-      <w:pStyle w:val="Header"/>
-    </w:pPr>
-  </w:p>
-</w:hdr>
-</file>
-
-<file path=word/header2.xml><?xml version="1.0" encoding="utf-8"?>
 <w:hdr xmlns:wpc="http://schemas.microsoft.com/office/word/2010/wordprocessingCanvas" xmlns:cx="http://schemas.microsoft.com/office/drawing/2014/chartex" xmlns:cx1="http://schemas.microsoft.com/office/drawing/2015/9/8/chartex" xmlns:cx2="http://schemas.microsoft.com/office/drawing/2015/10/21/chartex" xmlns:cx3="http://schemas.microsoft.com/office/drawing/2016/5/9/chartex" xmlns:cx4="http://schemas.microsoft.com/office/drawing/2016/5/10/chartex" xmlns:cx5="http://schemas.microsoft.com/office/drawing/2016/5/11/chartex" xmlns:cx6="http://schemas.microsoft.com/office/drawing/2016/5/12/chartex" xmlns:cx7="http://schemas.microsoft.com/office/drawing/2016/5/13/chartex" xmlns:cx8="http://schemas.microsoft.com/office/drawing/2016/5/14/chartex" xmlns:mc="http://schemas.openxmlformats.org/markup-compatibility/2006" xmlns:aink="http://schemas.microsoft.com/office/drawing/2016/ink" xmlns:am3d="http://schemas.microsoft.com/office/drawing/2017/model3d" xmlns:o="urn:schemas-microsoft-com:office:office" xmlns:oel="http://schemas.microsoft.com/office/2019/extlst" xmlns:r="http://schemas.openxmlformats.org/officeDocument/2006/relationships" xmlns:m="http://schemas.openxmlformats.org/officeDocument/2006/math" xmlns:v="urn:schemas-microsoft-com:vml" xmlns:wp14="http://schemas.microsoft.com/office/word/2010/wordprocessingDrawing" xmlns:wp="http://schemas.openxmlformats.org/drawingml/2006/wordprocessingDrawing" xmlns:w10="urn:schemas-microsoft-com:office:word" xmlns:w="http://schemas.openxmlformats.org/wordprocessingml/2006/main" xmlns:w14="http://schemas.microsoft.com/office/word/2010/wordml" xmlns:w15="http://schemas.microsoft.com/office/word/2012/wordml" xmlns:w16cei="http://schemas.microsoft.com/office/word/2026/wordml/cei" xmlns:w16cex="http://schemas.microsoft.com/office/word/2018/wordml/cex" xmlns:w16cid="http://schemas.microsoft.com/office/word/2016/wordml/cid" xmlns:w16="http://schemas.microsoft.com/office/word/2018/wordml" xmlns:w16du="http://schemas.microsoft.com/office/word/2023/wordml/word16du" xmlns:w16sdtdh="http://schemas.microsoft.com/office/word/2020/wordml/sdtdatahash" xmlns:w16sdtfl="http://schemas.microsoft.com/office/word/2024/wordml/sdtformatlock" xmlns:w16se="http://schemas.microsoft.com/office/word/2015/wordml/symex" xmlns:wpg="http://schemas.microsoft.com/office/word/2010/wordprocessingGroup" xmlns:wpi="http://schemas.microsoft.com/office/word/2010/wordprocessingInk" xmlns:wne="http://schemas.microsoft.com/office/word/2006/wordml" xmlns:wps="http://schemas.microsoft.com/office/word/2010/wordprocessingShape" mc:Ignorable="w14 w15 w16se w16cid w16 w16cex w16sdtdh w16sdtfl w16du wp14">
   <w:p>
     <w:pPr>
@@ -5281,16 +5244,6 @@
       </w:rPr>
       <w:t>SonarQube vs GitHub CodeQL POC  |  Confidential</w:t>
     </w:r>
-  </w:p>
-</w:hdr>
-</file>
-
-<file path=word/header3.xml><?xml version="1.0" encoding="utf-8"?>
-<w:hdr xmlns:wpc="http://schemas.microsoft.com/office/word/2010/wordprocessingCanvas" xmlns:cx="http://schemas.microsoft.com/office/drawing/2014/chartex" xmlns:cx1="http://schemas.microsoft.com/office/drawing/2015/9/8/chartex" xmlns:cx2="http://schemas.microsoft.com/office/drawing/2015/10/21/chartex" xmlns:cx3="http://schemas.microsoft.com/office/drawing/2016/5/9/chartex" xmlns:cx4="http://schemas.microsoft.com/office/drawing/2016/5/10/chartex" xmlns:cx5="http://schemas.microsoft.com/office/drawing/2016/5/11/chartex" xmlns:cx6="http://schemas.microsoft.com/office/drawing/2016/5/12/chartex" xmlns:cx7="http://schemas.microsoft.com/office/drawing/2016/5/13/chartex" xmlns:cx8="http://schemas.microsoft.com/office/drawing/2016/5/14/chartex" xmlns:mc="http://schemas.openxmlformats.org/markup-compatibility/2006" xmlns:aink="http://schemas.microsoft.com/office/drawing/2016/ink" xmlns:am3d="http://schemas.microsoft.com/office/drawing/2017/model3d" xmlns:o="urn:schemas-microsoft-com:office:office" xmlns:oel="http://schemas.microsoft.com/office/2019/extlst" xmlns:r="http://schemas.openxmlformats.org/officeDocument/2006/relationships" xmlns:m="http://schemas.openxmlformats.org/officeDocument/2006/math" xmlns:v="urn:schemas-microsoft-com:vml" xmlns:wp14="http://schemas.microsoft.com/office/word/2010/wordprocessingDrawing" xmlns:wp="http://schemas.openxmlformats.org/drawingml/2006/wordprocessingDrawing" xmlns:w10="urn:schemas-microsoft-com:office:word" xmlns:w="http://schemas.openxmlformats.org/wordprocessingml/2006/main" xmlns:w14="http://schemas.microsoft.com/office/word/2010/wordml" xmlns:w15="http://schemas.microsoft.com/office/word/2012/wordml" xmlns:w16cei="http://schemas.microsoft.com/office/word/2026/wordml/cei" xmlns:w16cex="http://schemas.microsoft.com/office/word/2018/wordml/cex" xmlns:w16cid="http://schemas.microsoft.com/office/word/2016/wordml/cid" xmlns:w16="http://schemas.microsoft.com/office/word/2018/wordml" xmlns:w16du="http://schemas.microsoft.com/office/word/2023/wordml/word16du" xmlns:w16sdtdh="http://schemas.microsoft.com/office/word/2020/wordml/sdtdatahash" xmlns:w16sdtfl="http://schemas.microsoft.com/office/word/2024/wordml/sdtformatlock" xmlns:w16se="http://schemas.microsoft.com/office/word/2015/wordml/symex" xmlns:wpg="http://schemas.microsoft.com/office/word/2010/wordprocessingGroup" xmlns:wpi="http://schemas.microsoft.com/office/word/2010/wordprocessingInk" xmlns:wne="http://schemas.microsoft.com/office/word/2006/wordml" xmlns:wps="http://schemas.microsoft.com/office/word/2010/wordprocessingShape" mc:Ignorable="w14 w15 w16se w16cid w16 w16cex w16sdtdh w16sdtfl w16du wp14">
-  <w:p>
-    <w:pPr>
-      <w:pStyle w:val="Header"/>
-    </w:pPr>
   </w:p>
 </w:hdr>
 </file>

</xml_diff>